<commit_message>
chart of the day update
</commit_message>
<xml_diff>
--- a/ChartOfTheDay/uk_living_standards/chart_takeaway.docx
+++ b/ChartOfTheDay/uk_living_standards/chart_takeaway.docx
@@ -10,7 +10,7 @@
           <w:color w:val="000000"/>
           <w:shd w:val="clear" w:color="auto" w:fill="FFFFFF"/>
         </w:rPr>
-        <w:t>The relationship between economic output and household living standards is broadly positive. Regions with higher Gross Value Added tend to have higher Gross Disposable Household Income. Yet the scatter plot reveals a geographic separation</w:t>
+        <w:t>Higher productivity broadly means higher household incomes across the UK</w:t>
       </w:r>
       <w:r>
         <w:rPr>
@@ -19,7 +19,7 @@
           <w:color w:val="000000"/>
           <w:shd w:val="clear" w:color="auto" w:fill="FFFFFF"/>
         </w:rPr>
-        <w:t xml:space="preserve">: </w:t>
+        <w:t>,</w:t>
       </w:r>
       <w:r>
         <w:rPr>
@@ -28,43 +28,7 @@
           <w:color w:val="000000"/>
           <w:shd w:val="clear" w:color="auto" w:fill="FFFFFF"/>
         </w:rPr>
-        <w:t>English regions with a GVA of £30–£40 per hour worked tend to have noticeably higher household incomes than Scottish regions at similar productivity levels</w:t>
-      </w:r>
-      <w:r>
-        <w:rPr>
-          <w:rStyle w:val="normaltextrun"/>
-          <w:rFonts w:ascii="Aptos" w:hAnsi="Aptos"/>
-          <w:color w:val="000000"/>
-          <w:shd w:val="clear" w:color="auto" w:fill="FFFFFF"/>
-        </w:rPr>
-        <w:t xml:space="preserve">. This suggests that productivity gains in England </w:t>
-      </w:r>
-      <w:r>
-        <w:rPr>
-          <w:rStyle w:val="normaltextrun"/>
-          <w:rFonts w:ascii="Aptos" w:hAnsi="Aptos"/>
-          <w:color w:val="000000"/>
-          <w:shd w:val="clear" w:color="auto" w:fill="FFFFFF"/>
-        </w:rPr>
-        <w:t xml:space="preserve">may </w:t>
-      </w:r>
-      <w:r>
-        <w:rPr>
-          <w:rStyle w:val="normaltextrun"/>
-          <w:rFonts w:ascii="Aptos" w:hAnsi="Aptos"/>
-          <w:color w:val="000000"/>
-          <w:shd w:val="clear" w:color="auto" w:fill="FFFFFF"/>
-        </w:rPr>
-        <w:t>translate more effectively into household income</w:t>
-      </w:r>
-      <w:r>
-        <w:rPr>
-          <w:rStyle w:val="normaltextrun"/>
-          <w:rFonts w:ascii="Aptos" w:hAnsi="Aptos"/>
-          <w:color w:val="000000"/>
-          <w:shd w:val="clear" w:color="auto" w:fill="FFFFFF"/>
-        </w:rPr>
-        <w:t>s in English regions.</w:t>
+        <w:t xml:space="preserve"> but not equally so. English regions with a GVA of £30–£40 per hour worked tend to out-earn Scottish regions at similar productivity, suggesting productivity gains don't translate uniformly into living standards.</w:t>
       </w:r>
     </w:p>
     <w:sectPr>

</xml_diff>